<commit_message>
Made changes to all figures being used in my thesis. Also created anova tables. As well as figures used to visualise emmeans
</commit_message>
<xml_diff>
--- a/anova_table.docx
+++ b/anova_table.docx
@@ -637,7 +637,7 @@
                 <w:szCs w:val="22"/>
                 <w:color w:val="000000"/>
               </w:rPr>
-              <w:t xml:space="preserve">153.8</w:t>
+              <w:t xml:space="preserve">153.9</w:t>
             </w:r>
           </w:p>
         </w:tc>
@@ -2144,7 +2144,7 @@
         <w:tc>
           <w:tcPr>
             <w:tcBorders>
-              <w:bottom w:val="single" w:sz="12" w:space="0" w:color="666666"/>
+              <w:bottom w:val="none" w:sz="0" w:space="0" w:color="000000"/>
               <w:top w:val="none" w:sz="0" w:space="0" w:color="000000"/>
               <w:left w:val="none" w:sz="0" w:space="0" w:color="000000"/>
               <w:right w:val="none" w:sz="0" w:space="0" w:color="000000"/>
@@ -2199,7 +2199,7 @@
         <w:tc>
           <w:tcPr>
             <w:tcBorders>
-              <w:bottom w:val="single" w:sz="12" w:space="0" w:color="666666"/>
+              <w:bottom w:val="none" w:sz="0" w:space="0" w:color="000000"/>
               <w:top w:val="none" w:sz="0" w:space="0" w:color="000000"/>
               <w:left w:val="none" w:sz="0" w:space="0" w:color="000000"/>
               <w:right w:val="none" w:sz="0" w:space="0" w:color="000000"/>
@@ -2417,7 +2417,7 @@
                 <w:szCs w:val="22"/>
                 <w:color w:val="000000"/>
               </w:rPr>
-              <w:t xml:space="preserve">144.2</w:t>
+              <w:t xml:space="preserve">144.3</w:t>
             </w:r>
           </w:p>
         </w:tc>
@@ -2589,7 +2589,7 @@
         <w:tc>
           <w:tcPr>
             <w:tcBorders>
-              <w:bottom w:val="single" w:sz="12" w:space="0" w:color="666666"/>
+              <w:bottom w:val="none" w:sz="0" w:space="0" w:color="000000"/>
               <w:top w:val="none" w:sz="0" w:space="0" w:color="000000"/>
               <w:left w:val="none" w:sz="0" w:space="0" w:color="000000"/>
               <w:right w:val="none" w:sz="0" w:space="0" w:color="000000"/>
@@ -2644,7 +2644,7 @@
         <w:tc>
           <w:tcPr>
             <w:tcBorders>
-              <w:bottom w:val="single" w:sz="12" w:space="0" w:color="666666"/>
+              <w:bottom w:val="none" w:sz="0" w:space="0" w:color="000000"/>
               <w:top w:val="none" w:sz="0" w:space="0" w:color="000000"/>
               <w:left w:val="none" w:sz="0" w:space="0" w:color="000000"/>
               <w:right w:val="none" w:sz="0" w:space="0" w:color="000000"/>
@@ -3479,7 +3479,7 @@
         <w:tc>
           <w:tcPr>
             <w:tcBorders>
-              <w:bottom w:val="none" w:sz="0" w:space="0" w:color="000000"/>
+              <w:bottom w:val="single" w:sz="12" w:space="0" w:color="666666"/>
               <w:top w:val="none" w:sz="0" w:space="0" w:color="000000"/>
               <w:left w:val="none" w:sz="0" w:space="0" w:color="000000"/>
               <w:right w:val="none" w:sz="0" w:space="0" w:color="000000"/>
@@ -3534,7 +3534,7 @@
         <w:tc>
           <w:tcPr>
             <w:tcBorders>
-              <w:bottom w:val="none" w:sz="0" w:space="0" w:color="000000"/>
+              <w:bottom w:val="single" w:sz="12" w:space="0" w:color="666666"/>
               <w:top w:val="none" w:sz="0" w:space="0" w:color="000000"/>
               <w:left w:val="none" w:sz="0" w:space="0" w:color="000000"/>
               <w:right w:val="none" w:sz="0" w:space="0" w:color="000000"/>

</xml_diff>